<commit_message>
[FEAT] modo contabilidade v1
</commit_message>
<xml_diff>
--- a/anotações/Checklist geral de melhorias do Prazzu.docx
+++ b/anotações/Checklist geral de melhorias do Prazzu.docx
@@ -1258,6 +1258,21 @@
       </w:r>
     </w:p>
     <w:p/>
+    <w:p/>
+    <w:p/>
+    <w:p/>
+    <w:p/>
+    <w:p/>
+    <w:p/>
+    <w:p/>
+    <w:p/>
+    <w:p>
+      <w:pPr>
+        <w:rPr>
+          <w:u w:val="single"/>
+        </w:rPr>
+      </w:pPr>
+    </w:p>
     <w:sectPr>
       <w:pgSz w:w="11906" w:h="16838"/>
       <w:pgMar w:top="1417" w:right="1701" w:bottom="1417" w:left="1701" w:header="708" w:footer="708" w:gutter="0"/>
@@ -1271,6 +1286,155 @@
 <file path=word/numbering.xml><?xml version="1.0" encoding="utf-8"?>
 <w:numbering xmlns:wpc="http://schemas.microsoft.com/office/word/2010/wordprocessingCanvas" xmlns:cx="http://schemas.microsoft.com/office/drawing/2014/chartex" xmlns:cx1="http://schemas.microsoft.com/office/drawing/2015/9/8/chartex" xmlns:cx2="http://schemas.microsoft.com/office/drawing/2015/10/21/chartex" xmlns:cx3="http://schemas.microsoft.com/office/drawing/2016/5/9/chartex" xmlns:cx4="http://schemas.microsoft.com/office/drawing/2016/5/10/chartex" xmlns:cx5="http://schemas.microsoft.com/office/drawing/2016/5/11/chartex" xmlns:cx6="http://schemas.microsoft.com/office/drawing/2016/5/12/chartex" xmlns:cx7="http://schemas.microsoft.com/office/drawing/2016/5/13/chartex" xmlns:cx8="http://schemas.microsoft.com/office/drawing/2016/5/14/chartex" xmlns:mc="http://schemas.openxmlformats.org/markup-compatibility/2006" xmlns:aink="http://schemas.microsoft.com/office/drawing/2016/ink" xmlns:am3d="http://schemas.microsoft.com/office/drawing/2017/model3d" xmlns:o="urn:schemas-microsoft-com:office:office" xmlns:oel="http://schemas.microsoft.com/office/2019/extlst" xmlns:r="http://schemas.openxmlformats.org/officeDocument/2006/relationships" xmlns:m="http://schemas.openxmlformats.org/officeDocument/2006/math" xmlns:v="urn:schemas-microsoft-com:vml" xmlns:wp14="http://schemas.microsoft.com/office/word/2010/wordprocessingDrawing" xmlns:wp="http://schemas.openxmlformats.org/drawingml/2006/wordprocessingDrawing" xmlns:w10="urn:schemas-microsoft-com:office:word" xmlns:w="http://schemas.openxmlformats.org/wordprocessingml/2006/main" xmlns:w14="http://schemas.microsoft.com/office/word/2010/wordml" xmlns:w15="http://schemas.microsoft.com/office/word/2012/wordml" xmlns:w16cex="http://schemas.microsoft.com/office/word/2018/wordml/cex" xmlns:w16cid="http://schemas.microsoft.com/office/word/2016/wordml/cid" xmlns:w16="http://schemas.microsoft.com/office/word/2018/wordml" xmlns:w16sdtdh="http://schemas.microsoft.com/office/word/2020/wordml/sdtdatahash" xmlns:w16se="http://schemas.microsoft.com/office/word/2015/wordml/symex" xmlns:wpg="http://schemas.microsoft.com/office/word/2010/wordprocessingGroup" xmlns:wpi="http://schemas.microsoft.com/office/word/2010/wordprocessingInk" xmlns:wne="http://schemas.microsoft.com/office/word/2006/wordml" xmlns:wps="http://schemas.microsoft.com/office/word/2010/wordprocessingShape" mc:Ignorable="w14 w15 w16se w16cid w16 w16cex w16sdtdh wp14">
   <w:abstractNum w:abstractNumId="0" w15:restartNumberingAfterBreak="0">
+    <w:nsid w:val="0B2662F6"/>
+    <w:multiLevelType w:val="multilevel"/>
+    <w:tmpl w:val="8EA86050"/>
+    <w:lvl w:ilvl="0">
+      <w:start w:val="1"/>
+      <w:numFmt w:val="bullet"/>
+      <w:lvlText w:val=""/>
+      <w:lvlJc w:val="left"/>
+      <w:pPr>
+        <w:tabs>
+          <w:tab w:val="num" w:pos="720"/>
+        </w:tabs>
+        <w:ind w:left="720" w:hanging="360"/>
+      </w:pPr>
+      <w:rPr>
+        <w:rFonts w:ascii="Symbol" w:hAnsi="Symbol" w:hint="default"/>
+        <w:sz w:val="20"/>
+      </w:rPr>
+    </w:lvl>
+    <w:lvl w:ilvl="1" w:tentative="1">
+      <w:start w:val="1"/>
+      <w:numFmt w:val="bullet"/>
+      <w:lvlText w:val="o"/>
+      <w:lvlJc w:val="left"/>
+      <w:pPr>
+        <w:tabs>
+          <w:tab w:val="num" w:pos="1440"/>
+        </w:tabs>
+        <w:ind w:left="1440" w:hanging="360"/>
+      </w:pPr>
+      <w:rPr>
+        <w:rFonts w:ascii="Courier New" w:hAnsi="Courier New" w:hint="default"/>
+        <w:sz w:val="20"/>
+      </w:rPr>
+    </w:lvl>
+    <w:lvl w:ilvl="2" w:tentative="1">
+      <w:start w:val="1"/>
+      <w:numFmt w:val="bullet"/>
+      <w:lvlText w:val=""/>
+      <w:lvlJc w:val="left"/>
+      <w:pPr>
+        <w:tabs>
+          <w:tab w:val="num" w:pos="2160"/>
+        </w:tabs>
+        <w:ind w:left="2160" w:hanging="360"/>
+      </w:pPr>
+      <w:rPr>
+        <w:rFonts w:ascii="Wingdings" w:hAnsi="Wingdings" w:hint="default"/>
+        <w:sz w:val="20"/>
+      </w:rPr>
+    </w:lvl>
+    <w:lvl w:ilvl="3" w:tentative="1">
+      <w:start w:val="1"/>
+      <w:numFmt w:val="bullet"/>
+      <w:lvlText w:val=""/>
+      <w:lvlJc w:val="left"/>
+      <w:pPr>
+        <w:tabs>
+          <w:tab w:val="num" w:pos="2880"/>
+        </w:tabs>
+        <w:ind w:left="2880" w:hanging="360"/>
+      </w:pPr>
+      <w:rPr>
+        <w:rFonts w:ascii="Wingdings" w:hAnsi="Wingdings" w:hint="default"/>
+        <w:sz w:val="20"/>
+      </w:rPr>
+    </w:lvl>
+    <w:lvl w:ilvl="4" w:tentative="1">
+      <w:start w:val="1"/>
+      <w:numFmt w:val="bullet"/>
+      <w:lvlText w:val=""/>
+      <w:lvlJc w:val="left"/>
+      <w:pPr>
+        <w:tabs>
+          <w:tab w:val="num" w:pos="3600"/>
+        </w:tabs>
+        <w:ind w:left="3600" w:hanging="360"/>
+      </w:pPr>
+      <w:rPr>
+        <w:rFonts w:ascii="Wingdings" w:hAnsi="Wingdings" w:hint="default"/>
+        <w:sz w:val="20"/>
+      </w:rPr>
+    </w:lvl>
+    <w:lvl w:ilvl="5" w:tentative="1">
+      <w:start w:val="1"/>
+      <w:numFmt w:val="bullet"/>
+      <w:lvlText w:val=""/>
+      <w:lvlJc w:val="left"/>
+      <w:pPr>
+        <w:tabs>
+          <w:tab w:val="num" w:pos="4320"/>
+        </w:tabs>
+        <w:ind w:left="4320" w:hanging="360"/>
+      </w:pPr>
+      <w:rPr>
+        <w:rFonts w:ascii="Wingdings" w:hAnsi="Wingdings" w:hint="default"/>
+        <w:sz w:val="20"/>
+      </w:rPr>
+    </w:lvl>
+    <w:lvl w:ilvl="6" w:tentative="1">
+      <w:start w:val="1"/>
+      <w:numFmt w:val="bullet"/>
+      <w:lvlText w:val=""/>
+      <w:lvlJc w:val="left"/>
+      <w:pPr>
+        <w:tabs>
+          <w:tab w:val="num" w:pos="5040"/>
+        </w:tabs>
+        <w:ind w:left="5040" w:hanging="360"/>
+      </w:pPr>
+      <w:rPr>
+        <w:rFonts w:ascii="Wingdings" w:hAnsi="Wingdings" w:hint="default"/>
+        <w:sz w:val="20"/>
+      </w:rPr>
+    </w:lvl>
+    <w:lvl w:ilvl="7" w:tentative="1">
+      <w:start w:val="1"/>
+      <w:numFmt w:val="bullet"/>
+      <w:lvlText w:val=""/>
+      <w:lvlJc w:val="left"/>
+      <w:pPr>
+        <w:tabs>
+          <w:tab w:val="num" w:pos="5760"/>
+        </w:tabs>
+        <w:ind w:left="5760" w:hanging="360"/>
+      </w:pPr>
+      <w:rPr>
+        <w:rFonts w:ascii="Wingdings" w:hAnsi="Wingdings" w:hint="default"/>
+        <w:sz w:val="20"/>
+      </w:rPr>
+    </w:lvl>
+    <w:lvl w:ilvl="8" w:tentative="1">
+      <w:start w:val="1"/>
+      <w:numFmt w:val="bullet"/>
+      <w:lvlText w:val=""/>
+      <w:lvlJc w:val="left"/>
+      <w:pPr>
+        <w:tabs>
+          <w:tab w:val="num" w:pos="6480"/>
+        </w:tabs>
+        <w:ind w:left="6480" w:hanging="360"/>
+      </w:pPr>
+      <w:rPr>
+        <w:rFonts w:ascii="Wingdings" w:hAnsi="Wingdings" w:hint="default"/>
+        <w:sz w:val="20"/>
+      </w:rPr>
+    </w:lvl>
+  </w:abstractNum>
+  <w:abstractNum w:abstractNumId="1" w15:restartNumberingAfterBreak="0">
     <w:nsid w:val="0CED07FD"/>
     <w:multiLevelType w:val="multilevel"/>
     <w:tmpl w:val="3E605526"/>
@@ -1419,7 +1583,7 @@
       </w:rPr>
     </w:lvl>
   </w:abstractNum>
-  <w:abstractNum w:abstractNumId="1" w15:restartNumberingAfterBreak="0">
+  <w:abstractNum w:abstractNumId="2" w15:restartNumberingAfterBreak="0">
     <w:nsid w:val="0D180D6F"/>
     <w:multiLevelType w:val="multilevel"/>
     <w:tmpl w:val="FA1CB190"/>
@@ -1568,7 +1732,7 @@
       </w:rPr>
     </w:lvl>
   </w:abstractNum>
-  <w:abstractNum w:abstractNumId="2" w15:restartNumberingAfterBreak="0">
+  <w:abstractNum w:abstractNumId="3" w15:restartNumberingAfterBreak="0">
     <w:nsid w:val="1008286A"/>
     <w:multiLevelType w:val="multilevel"/>
     <w:tmpl w:val="3FEC983E"/>
@@ -1717,7 +1881,7 @@
       </w:rPr>
     </w:lvl>
   </w:abstractNum>
-  <w:abstractNum w:abstractNumId="3" w15:restartNumberingAfterBreak="0">
+  <w:abstractNum w:abstractNumId="4" w15:restartNumberingAfterBreak="0">
     <w:nsid w:val="168F1396"/>
     <w:multiLevelType w:val="multilevel"/>
     <w:tmpl w:val="319CB50A"/>
@@ -1866,7 +2030,7 @@
       </w:rPr>
     </w:lvl>
   </w:abstractNum>
-  <w:abstractNum w:abstractNumId="4" w15:restartNumberingAfterBreak="0">
+  <w:abstractNum w:abstractNumId="5" w15:restartNumberingAfterBreak="0">
     <w:nsid w:val="44443996"/>
     <w:multiLevelType w:val="multilevel"/>
     <w:tmpl w:val="FA58B2C2"/>
@@ -2015,7 +2179,7 @@
       </w:rPr>
     </w:lvl>
   </w:abstractNum>
-  <w:abstractNum w:abstractNumId="5" w15:restartNumberingAfterBreak="0">
+  <w:abstractNum w:abstractNumId="6" w15:restartNumberingAfterBreak="0">
     <w:nsid w:val="5190525B"/>
     <w:multiLevelType w:val="multilevel"/>
     <w:tmpl w:val="42540BEA"/>
@@ -2164,7 +2328,7 @@
       </w:rPr>
     </w:lvl>
   </w:abstractNum>
-  <w:abstractNum w:abstractNumId="6" w15:restartNumberingAfterBreak="0">
+  <w:abstractNum w:abstractNumId="7" w15:restartNumberingAfterBreak="0">
     <w:nsid w:val="55CA6ECE"/>
     <w:multiLevelType w:val="multilevel"/>
     <w:tmpl w:val="4248140E"/>
@@ -2313,7 +2477,7 @@
       </w:rPr>
     </w:lvl>
   </w:abstractNum>
-  <w:abstractNum w:abstractNumId="7" w15:restartNumberingAfterBreak="0">
+  <w:abstractNum w:abstractNumId="8" w15:restartNumberingAfterBreak="0">
     <w:nsid w:val="63A864AE"/>
     <w:multiLevelType w:val="multilevel"/>
     <w:tmpl w:val="4C5E0838"/>
@@ -2462,7 +2626,7 @@
       </w:rPr>
     </w:lvl>
   </w:abstractNum>
-  <w:abstractNum w:abstractNumId="8" w15:restartNumberingAfterBreak="0">
+  <w:abstractNum w:abstractNumId="9" w15:restartNumberingAfterBreak="0">
     <w:nsid w:val="670630D7"/>
     <w:multiLevelType w:val="multilevel"/>
     <w:tmpl w:val="E8D28762"/>
@@ -2611,7 +2775,7 @@
       </w:rPr>
     </w:lvl>
   </w:abstractNum>
-  <w:abstractNum w:abstractNumId="9" w15:restartNumberingAfterBreak="0">
+  <w:abstractNum w:abstractNumId="10" w15:restartNumberingAfterBreak="0">
     <w:nsid w:val="713727E3"/>
     <w:multiLevelType w:val="multilevel"/>
     <w:tmpl w:val="BF909EA4"/>
@@ -2761,34 +2925,37 @@
     </w:lvl>
   </w:abstractNum>
   <w:num w:numId="1" w16cid:durableId="1529298704">
+    <w:abstractNumId w:val="7"/>
+  </w:num>
+  <w:num w:numId="2" w16cid:durableId="34475305">
+    <w:abstractNumId w:val="3"/>
+  </w:num>
+  <w:num w:numId="3" w16cid:durableId="1197426494">
+    <w:abstractNumId w:val="2"/>
+  </w:num>
+  <w:num w:numId="4" w16cid:durableId="1083642413">
     <w:abstractNumId w:val="6"/>
   </w:num>
-  <w:num w:numId="2" w16cid:durableId="34475305">
-    <w:abstractNumId w:val="2"/>
+  <w:num w:numId="5" w16cid:durableId="1202591096">
+    <w:abstractNumId w:val="10"/>
   </w:num>
-  <w:num w:numId="3" w16cid:durableId="1197426494">
+  <w:num w:numId="6" w16cid:durableId="516575436">
+    <w:abstractNumId w:val="5"/>
+  </w:num>
+  <w:num w:numId="7" w16cid:durableId="692927351">
+    <w:abstractNumId w:val="9"/>
+  </w:num>
+  <w:num w:numId="8" w16cid:durableId="1773743360">
+    <w:abstractNumId w:val="4"/>
+  </w:num>
+  <w:num w:numId="9" w16cid:durableId="2145074629">
     <w:abstractNumId w:val="1"/>
   </w:num>
-  <w:num w:numId="4" w16cid:durableId="1083642413">
-    <w:abstractNumId w:val="5"/>
-  </w:num>
-  <w:num w:numId="5" w16cid:durableId="1202591096">
-    <w:abstractNumId w:val="9"/>
-  </w:num>
-  <w:num w:numId="6" w16cid:durableId="516575436">
-    <w:abstractNumId w:val="4"/>
-  </w:num>
-  <w:num w:numId="7" w16cid:durableId="692927351">
+  <w:num w:numId="10" w16cid:durableId="1667437874">
     <w:abstractNumId w:val="8"/>
   </w:num>
-  <w:num w:numId="8" w16cid:durableId="1773743360">
-    <w:abstractNumId w:val="3"/>
-  </w:num>
-  <w:num w:numId="9" w16cid:durableId="2145074629">
+  <w:num w:numId="11" w16cid:durableId="923487786">
     <w:abstractNumId w:val="0"/>
-  </w:num>
-  <w:num w:numId="10" w16cid:durableId="1667437874">
-    <w:abstractNumId w:val="7"/>
   </w:num>
 </w:numbering>
 </file>
@@ -3396,6 +3563,7 @@
   <w:style w:type="character" w:default="1" w:styleId="Fontepargpadro">
     <w:name w:val="Default Paragraph Font"/>
     <w:uiPriority w:val="1"/>
+    <w:semiHidden/>
     <w:unhideWhenUsed/>
   </w:style>
   <w:style w:type="table" w:default="1" w:styleId="Tabelanormal">

</xml_diff>